<commit_message>
Apply Jeppe's HR changes; repo-driven change-request status; fix owner card
Human Rights Policy (Jeppe's request a9cce091):
- Whistleblower/Speak-Up Line now managed by the Ethics Committee, 60-day
  feedback wording (was Schouw & Co. / 90 days).
- 'Modern Slavery Policy (Australia and UK)' merged; stray '(Australia and UK)'
  line removed.

Change-request lifecycle moved from D1 to the repo (policies/pending.json) so the
AI can move a request to 'pending_review' by editing the file when it ships the
change, and the dashboard chip updates (change_pending -> pending_review ->
approved). Seeded HR as pending_review since the change is done.

Owner/Approver card on unsigned variants: fixed height (last row no longer
overflows the box) and placed at the top, like the other policies.

Co-Authored-By: Claude Opus 4.8 <noreply@anthropic.com>
Claude-Session: https://claude.ai/code/session_01W3gw8scX9B7oMC33JPxjbS
</commit_message>
<xml_diff>
--- a/policies/sources/human-rights-policy__Policy.docx
+++ b/policies/sources/human-rights-policy__Policy.docx
@@ -185,12 +185,7 @@
     </w:p>
     <w:p>
       <w:r>
-        <w:t>As a last-resort mechanism, when anonymity is essential or other reporting channels might not be appropriate, BioMar employees and third parties can report suspected violations of laws, our Code of Conduct, policies or standards through the whistleblower channel: the BioMar Speak-Up Line. This platform is managed by Schouw &amp; Co. via a secure and confidential process, and any grievances are addressed within a maximum of 90 days.</w:t>
-      </w:r>
-    </w:p>
-    <w:p>
-      <w:r>
-        <w:t>the Ethics Committee via a secure and confidental process, and any investigations will provide feedback to the reporter within a reasonable timeframe and no later than 60 days from acknowledgement, or within the extended timeframe permitted by law for complex cases.</w:t>
+        <w:t>As a last-resort mechanism, when anonymity is essential or other reporting channels might not be appropriate, BioMar employees and third parties can report suspected violations of laws, our Code of Conduct, policies or standards through the whistleblower channel: the BioMar Speak-Up Line. This platform is managed by the Ethics Committee via a secure and confidential process and will provide feedback to the reporter within a reasonable timeframe and no later than 60 days from acknowledgement, or within the extended timeframe permitted by law for complex cases.</w:t>
       </w:r>
     </w:p>
     <w:p>
@@ -274,16 +269,11 @@
       </w:r>
     </w:p>
     <w:p>
-      <w:r>
-        <w:t>(Australia and UK)</w:t>
-      </w:r>
-    </w:p>
-    <w:p>
       <w:pPr>
         <w:pStyle w:val="ListBullet"/>
       </w:pPr>
       <w:r>
-        <w:t>Modern Slavery Policy</w:t>
+        <w:t>Modern Slavery Policy (Australia and UK)</w:t>
       </w:r>
     </w:p>
     <w:p>

</xml_diff>